<commit_message>
docs: archive submitted first delivery sources
</commit_message>
<xml_diff>
--- a/docs/MODELO_DE_DATOS_Y_MODELO_OPERATIVO_G08.docx
+++ b/docs/MODELO_DE_DATOS_Y_MODELO_OPERATIVO_G08.docx
@@ -7043,23 +7043,7 @@
         <w:widowControl/>
       </w:pPr>
       <w:r>
-        <w:rPr>
-          <w:rFonts w:ascii="Arial" w:hAnsi="Arial"/>
-        </w:rPr>
-        <w:t xml:space="preserve">1. Cátedra IO51, </w:t>
-      </w:r>
-      <w:r>
-        <w:rPr>
-          <w:rFonts w:ascii="Arial" w:hAnsi="Arial"/>
-          <w:i/>
-        </w:rPr>
-        <w:t>Trabajo Práctico N° 2: Puerto Sur</w:t>
-      </w:r>
-      <w:r>
-        <w:rPr>
-          <w:rFonts w:ascii="Arial" w:hAnsi="Arial"/>
-        </w:rPr>
-        <w:t>, 2026 2C, enunciado general, especialmente pp. 1–6.</w:t>
+        <w:t>1. Cátedra IO51, IO51-TP2 - Puerto Sur.pdf, enunciado general, especialmente pp. 1–6.</w:t>
       </w:r>
     </w:p>
     <w:p>
@@ -7067,24 +7051,7 @@
         <w:widowControl/>
       </w:pPr>
       <w:r>
-        <w:rPr>
-          <w:rFonts w:ascii="Arial" w:hAnsi="Arial"/>
-        </w:rPr>
-        <w:t xml:space="preserve">2. </w:t>
-      </w:r>
-      <w:r>
-        <w:rPr>
-          <w:rFonts w:ascii="Courier New" w:hAnsi="Courier New"/>
-          <w:color w:val="1F3B59"/>
-          <w:sz w:val="18"/>
-        </w:rPr>
-        <w:t>data/PuertoSur_escalas_G08.csv</w:t>
-      </w:r>
-      <w:r>
-        <w:rPr>
-          <w:rFonts w:ascii="Arial" w:hAnsi="Arial"/>
-        </w:rPr>
-        <w:t>, registro histórico de Grupo 08.</w:t>
+        <w:t>2. data/PuertoSur_escalas_G08.csv, registro histórico de Grupo 08.</w:t>
       </w:r>
     </w:p>
     <w:p>
@@ -7092,23 +7059,7 @@
         <w:widowControl/>
       </w:pPr>
       <w:r>
-        <w:rPr>
-          <w:rFonts w:ascii="Arial" w:hAnsi="Arial"/>
-        </w:rPr>
-        <w:t xml:space="preserve">3. </w:t>
-      </w:r>
-      <w:r>
-        <w:rPr>
-          <w:rFonts w:ascii="Arial" w:hAnsi="Arial"/>
-          <w:i/>
-        </w:rPr>
-        <w:t>TP2_Grupo8.pdf</w:t>
-      </w:r>
-      <w:r>
-        <w:rPr>
-          <w:rFonts w:ascii="Arial" w:hAnsi="Arial"/>
-        </w:rPr>
-        <w:t>, primera entrega del Grupo 08: modelo conceptual.</w:t>
+        <w:t>3. docs/TP2_Grupo8_primera_entrega.pdf, modelo conceptual presentado por el Grupo 08.</w:t>
       </w:r>
     </w:p>
     <w:p>
@@ -7116,24 +7067,7 @@
         <w:widowControl/>
       </w:pPr>
       <w:r>
-        <w:rPr>
-          <w:rFonts w:ascii="Arial" w:hAnsi="Arial"/>
-        </w:rPr>
-        <w:t xml:space="preserve">4. </w:t>
-      </w:r>
-      <w:r>
-        <w:rPr>
-          <w:rFonts w:ascii="Courier New" w:hAnsi="Courier New"/>
-          <w:color w:val="1F3B59"/>
-          <w:sz w:val="18"/>
-        </w:rPr>
-        <w:t>MODELO_CONCEPTUAL_G08.md</w:t>
-      </w:r>
-      <w:r>
-        <w:rPr>
-          <w:rFonts w:ascii="Arial" w:hAnsi="Arial"/>
-        </w:rPr>
-        <w:t>, modelo conceptual en el repositorio.</w:t>
+        <w:t>4. Cátedra IO51, assets/IO51_Teoria_Simulacion_Modelo_de_Datos_Ajuste.pdf.</w:t>
       </w:r>
     </w:p>
     <w:p>
@@ -7141,32 +7075,7 @@
         <w:widowControl/>
       </w:pPr>
       <w:r>
-        <w:rPr>
-          <w:rFonts w:ascii="Arial" w:hAnsi="Arial"/>
-        </w:rPr>
-        <w:t xml:space="preserve">5. Cátedra IO51, </w:t>
-      </w:r>
-      <w:r>
-        <w:rPr>
-          <w:rFonts w:ascii="Courier New" w:hAnsi="Courier New"/>
-          <w:color w:val="1F3B59"/>
-          <w:sz w:val="18"/>
-        </w:rPr>
-        <w:t>assets/IO51_Teoria_Simulacion_Modelo_de_Datos_Ajuste.pdf</w:t>
-      </w:r>
-      <w:r>
-        <w:rPr>
-          <w:rFonts w:ascii="Arial" w:hAnsi="Arial"/>
-        </w:rPr>
-        <w:t>.</w:t>
-      </w:r>
-    </w:p>
-    <w:p>
-      <w:pPr>
-        <w:widowControl/>
-      </w:pPr>
-      <w:r>
-        <w:t>6. Código revisado del repositorio: ajuste de datos, parámetros, simulador y experimentos.</w:t>
+        <w:t>5. Código del repositorio: análisis de datos, parámetros, simulador y experimentos.</w:t>
       </w:r>
     </w:p>
     <w:sectPr>

</xml_diff>